<commit_message>
edition de largeur chaussée sur chemin et empierré (fixes #23)
</commit_message>
<xml_diff>
--- a/contribution directe (route).docx
+++ b/contribution directe (route).docx
@@ -179,7 +179,7 @@
                 <w:sz w:val="44"/>
                 <w:szCs w:val="44"/>
               </w:rPr>
-              <w:t>5</w:t>
+              <w:t>6</w:t>
             </w:r>
             <w:r>
               <w:rPr>
@@ -445,7 +445,7 @@
                     <w:b/>
                     <w:szCs w:val="18"/>
                   </w:rPr>
-                  <w:t>5</w:t>
+                  <w:t>6</w:t>
                 </w:r>
                 <w:r>
                   <w:rPr>
@@ -1650,6 +1650,107 @@
                 <w:rFonts w:cs="Arial"/>
                 <w:szCs w:val="18"/>
               </w:rPr>
+              <w:t>Adaptation à la version 1.5.0 du plugin</w:t>
+            </w:r>
+          </w:p>
+        </w:tc>
+      </w:tr>
+      <w:tr>
+        <w:tc>
+          <w:tcPr>
+            <w:tcW w:w="1122" w:type="dxa"/>
+          </w:tcPr>
+          <w:p>
+            <w:pPr>
+              <w:ind w:firstLine="0"/>
+              <w:jc w:val="center"/>
+              <w:rPr>
+                <w:rFonts w:cs="Arial"/>
+                <w:szCs w:val="18"/>
+              </w:rPr>
+            </w:pPr>
+            <w:r>
+              <w:rPr>
+                <w:rFonts w:cs="Arial"/>
+                <w:szCs w:val="18"/>
+              </w:rPr>
+              <w:t>1.</w:t>
+            </w:r>
+            <w:r>
+              <w:rPr>
+                <w:rFonts w:cs="Arial"/>
+                <w:szCs w:val="18"/>
+              </w:rPr>
+              <w:t>6</w:t>
+            </w:r>
+            <w:r>
+              <w:rPr>
+                <w:rFonts w:cs="Arial"/>
+                <w:szCs w:val="18"/>
+              </w:rPr>
+              <w:t>.0</w:t>
+            </w:r>
+          </w:p>
+        </w:tc>
+        <w:tc>
+          <w:tcPr>
+            <w:tcW w:w="1400" w:type="dxa"/>
+          </w:tcPr>
+          <w:p>
+            <w:pPr>
+              <w:ind w:firstLine="0"/>
+              <w:jc w:val="center"/>
+              <w:rPr>
+                <w:rFonts w:cs="Arial"/>
+                <w:szCs w:val="18"/>
+              </w:rPr>
+            </w:pPr>
+            <w:r>
+              <w:rPr>
+                <w:rFonts w:cs="Arial"/>
+                <w:szCs w:val="18"/>
+              </w:rPr>
+              <w:t>16/04/2026</w:t>
+            </w:r>
+          </w:p>
+        </w:tc>
+        <w:tc>
+          <w:tcPr>
+            <w:tcW w:w="2500" w:type="dxa"/>
+          </w:tcPr>
+          <w:p>
+            <w:pPr>
+              <w:rPr>
+                <w:rFonts w:cs="Arial"/>
+                <w:szCs w:val="18"/>
+              </w:rPr>
+            </w:pPr>
+            <w:r>
+              <w:rPr>
+                <w:rFonts w:cs="Arial"/>
+                <w:szCs w:val="18"/>
+              </w:rPr>
+              <w:t>Gérôme PECHEUR</w:t>
+            </w:r>
+          </w:p>
+        </w:tc>
+        <w:tc>
+          <w:tcPr>
+            <w:tcW w:w="4850" w:type="dxa"/>
+          </w:tcPr>
+          <w:p>
+            <w:pPr>
+              <w:ind w:firstLine="0"/>
+              <w:rPr>
+                <w:rFonts w:cs="Arial"/>
+                <w:szCs w:val="18"/>
+              </w:rPr>
+            </w:pPr>
+            <w:r>
+              <w:rPr>
+                <w:rFonts w:cs="Arial"/>
+                <w:szCs w:val="18"/>
+              </w:rPr>
               <w:t>Adaptation à la version 1.</w:t>
             </w:r>
             <w:r>
@@ -1657,7 +1758,7 @@
                 <w:rFonts w:cs="Arial"/>
                 <w:szCs w:val="18"/>
               </w:rPr>
-              <w:t>5</w:t>
+              <w:t>6</w:t>
             </w:r>
             <w:r>
               <w:rPr>
@@ -1694,6 +1795,20 @@
         </w:rPr>
       </w:sdtEndPr>
       <w:sdtContent>
+        <w:p>
+          <w:pPr>
+            <w:pStyle w:val="Sommaire"/>
+            <w:rPr>
+              <w:rFonts w:eastAsiaTheme="minorHAnsi" w:cs="Times New Roman"/>
+              <w:b w:val="0"/>
+              <w:bCs w:val="0"/>
+              <w:color w:val="92D050"/>
+              <w:kern w:val="0"/>
+              <w:sz w:val="18"/>
+              <w:szCs w:val="21"/>
+            </w:rPr>
+          </w:pPr>
+        </w:p>
         <w:p>
           <w:pPr>
             <w:pStyle w:val="Sommaire"/>
@@ -1729,7 +1844,7 @@
           <w:r>
             <w:fldChar w:fldCharType="separate"/>
           </w:r>
-          <w:hyperlink w:anchor="_Toc224564570" w:history="1">
+          <w:hyperlink w:anchor="_Toc227227673" w:history="1">
             <w:r>
               <w:rPr>
                 <w:rStyle w:val="Lienhypertexte"/>
@@ -1769,7 +1884,7 @@
               <w:rPr>
                 <w:webHidden/>
               </w:rPr>
-              <w:instrText xml:space="preserve"> PAGEREF _Toc224564570 \h </w:instrText>
+              <w:instrText xml:space="preserve"> PAGEREF _Toc227227673 \h </w:instrText>
             </w:r>
             <w:r>
               <w:rPr>
@@ -1808,7 +1923,7 @@
               <w14:ligatures w14:val="standardContextual"/>
             </w:rPr>
           </w:pPr>
-          <w:hyperlink w:anchor="_Toc224564571" w:history="1">
+          <w:hyperlink w:anchor="_Toc227227674" w:history="1">
             <w:r>
               <w:rPr>
                 <w:rStyle w:val="Lienhypertexte"/>
@@ -1848,7 +1963,7 @@
               <w:rPr>
                 <w:webHidden/>
               </w:rPr>
-              <w:instrText xml:space="preserve"> PAGEREF _Toc224564571 \h </w:instrText>
+              <w:instrText xml:space="preserve"> PAGEREF _Toc227227674 \h </w:instrText>
             </w:r>
             <w:r>
               <w:rPr>
@@ -1887,7 +2002,7 @@
               <w14:ligatures w14:val="standardContextual"/>
             </w:rPr>
           </w:pPr>
-          <w:hyperlink w:anchor="_Toc224564572" w:history="1">
+          <w:hyperlink w:anchor="_Toc227227675" w:history="1">
             <w:r>
               <w:rPr>
                 <w:rStyle w:val="Lienhypertexte"/>
@@ -1927,7 +2042,7 @@
               <w:rPr>
                 <w:webHidden/>
               </w:rPr>
-              <w:instrText xml:space="preserve"> PAGEREF _Toc224564572 \h </w:instrText>
+              <w:instrText xml:space="preserve"> PAGEREF _Toc227227675 \h </w:instrText>
             </w:r>
             <w:r>
               <w:rPr>
@@ -1966,7 +2081,7 @@
               <w14:ligatures w14:val="standardContextual"/>
             </w:rPr>
           </w:pPr>
-          <w:hyperlink w:anchor="_Toc224564573" w:history="1">
+          <w:hyperlink w:anchor="_Toc227227676" w:history="1">
             <w:r>
               <w:rPr>
                 <w:rStyle w:val="Lienhypertexte"/>
@@ -2006,7 +2121,7 @@
               <w:rPr>
                 <w:webHidden/>
               </w:rPr>
-              <w:instrText xml:space="preserve"> PAGEREF _Toc224564573 \h </w:instrText>
+              <w:instrText xml:space="preserve"> PAGEREF _Toc227227676 \h </w:instrText>
             </w:r>
             <w:r>
               <w:rPr>
@@ -2045,7 +2160,7 @@
               <w14:ligatures w14:val="standardContextual"/>
             </w:rPr>
           </w:pPr>
-          <w:hyperlink w:anchor="_Toc224564574" w:history="1">
+          <w:hyperlink w:anchor="_Toc227227677" w:history="1">
             <w:r>
               <w:rPr>
                 <w:rStyle w:val="Lienhypertexte"/>
@@ -2085,7 +2200,7 @@
               <w:rPr>
                 <w:webHidden/>
               </w:rPr>
-              <w:instrText xml:space="preserve"> PAGEREF _Toc224564574 \h </w:instrText>
+              <w:instrText xml:space="preserve"> PAGEREF _Toc227227677 \h </w:instrText>
             </w:r>
             <w:r>
               <w:rPr>
@@ -2123,7 +2238,7 @@
               <w14:ligatures w14:val="standardContextual"/>
             </w:rPr>
           </w:pPr>
-          <w:hyperlink w:anchor="_Toc224564575" w:history="1">
+          <w:hyperlink w:anchor="_Toc227227678" w:history="1">
             <w:r>
               <w:rPr>
                 <w:rStyle w:val="Lienhypertexte"/>
@@ -2162,7 +2277,7 @@
               <w:rPr>
                 <w:webHidden/>
               </w:rPr>
-              <w:instrText xml:space="preserve"> PAGEREF _Toc224564575 \h </w:instrText>
+              <w:instrText xml:space="preserve"> PAGEREF _Toc227227678 \h </w:instrText>
             </w:r>
             <w:r>
               <w:rPr>
@@ -2200,7 +2315,7 @@
               <w14:ligatures w14:val="standardContextual"/>
             </w:rPr>
           </w:pPr>
-          <w:hyperlink w:anchor="_Toc224564576" w:history="1">
+          <w:hyperlink w:anchor="_Toc227227679" w:history="1">
             <w:r>
               <w:rPr>
                 <w:rStyle w:val="Lienhypertexte"/>
@@ -2239,7 +2354,7 @@
               <w:rPr>
                 <w:webHidden/>
               </w:rPr>
-              <w:instrText xml:space="preserve"> PAGEREF _Toc224564576 \h </w:instrText>
+              <w:instrText xml:space="preserve"> PAGEREF _Toc227227679 \h </w:instrText>
             </w:r>
             <w:r>
               <w:rPr>
@@ -2278,7 +2393,7 @@
               <w14:ligatures w14:val="standardContextual"/>
             </w:rPr>
           </w:pPr>
-          <w:hyperlink w:anchor="_Toc224564577" w:history="1">
+          <w:hyperlink w:anchor="_Toc227227680" w:history="1">
             <w:r>
               <w:rPr>
                 <w:rStyle w:val="Lienhypertexte"/>
@@ -2318,7 +2433,7 @@
               <w:rPr>
                 <w:webHidden/>
               </w:rPr>
-              <w:instrText xml:space="preserve"> PAGEREF _Toc224564577 \h </w:instrText>
+              <w:instrText xml:space="preserve"> PAGEREF _Toc227227680 \h </w:instrText>
             </w:r>
             <w:r>
               <w:rPr>
@@ -2357,7 +2472,7 @@
               <w14:ligatures w14:val="standardContextual"/>
             </w:rPr>
           </w:pPr>
-          <w:hyperlink w:anchor="_Toc224564578" w:history="1">
+          <w:hyperlink w:anchor="_Toc227227681" w:history="1">
             <w:r>
               <w:rPr>
                 <w:rStyle w:val="Lienhypertexte"/>
@@ -2397,7 +2512,7 @@
               <w:rPr>
                 <w:webHidden/>
               </w:rPr>
-              <w:instrText xml:space="preserve"> PAGEREF _Toc224564578 \h </w:instrText>
+              <w:instrText xml:space="preserve"> PAGEREF _Toc227227681 \h </w:instrText>
             </w:r>
             <w:r>
               <w:rPr>
@@ -2435,7 +2550,7 @@
               <w14:ligatures w14:val="standardContextual"/>
             </w:rPr>
           </w:pPr>
-          <w:hyperlink w:anchor="_Toc224564579" w:history="1">
+          <w:hyperlink w:anchor="_Toc227227682" w:history="1">
             <w:r>
               <w:rPr>
                 <w:rStyle w:val="Lienhypertexte"/>
@@ -2474,7 +2589,7 @@
               <w:rPr>
                 <w:webHidden/>
               </w:rPr>
-              <w:instrText xml:space="preserve"> PAGEREF _Toc224564579 \h </w:instrText>
+              <w:instrText xml:space="preserve"> PAGEREF _Toc227227682 \h </w:instrText>
             </w:r>
             <w:r>
               <w:rPr>
@@ -2492,162 +2607,6 @@
                 <w:webHidden/>
               </w:rPr>
               <w:t>5</w:t>
-            </w:r>
-            <w:r>
-              <w:rPr>
-                <w:webHidden/>
-              </w:rPr>
-              <w:fldChar w:fldCharType="end"/>
-            </w:r>
-          </w:hyperlink>
-        </w:p>
-        <w:p>
-          <w:pPr>
-            <w:pStyle w:val="TM1"/>
-            <w:rPr>
-              <w:rFonts w:asciiTheme="minorHAnsi" w:eastAsiaTheme="minorEastAsia" w:hAnsiTheme="minorHAnsi" w:cstheme="minorBidi"/>
-              <w:smallCaps w:val="0"/>
-              <w:kern w:val="2"/>
-              <w:sz w:val="24"/>
-              <w:szCs w:val="24"/>
-              <w14:ligatures w14:val="standardContextual"/>
-            </w:rPr>
-          </w:pPr>
-          <w:hyperlink w:anchor="_Toc224564580" w:history="1">
-            <w:r>
-              <w:rPr>
-                <w:rStyle w:val="Lienhypertexte"/>
-              </w:rPr>
-              <w:t>8</w:t>
-            </w:r>
-            <w:r>
-              <w:rPr>
-                <w:rFonts w:asciiTheme="minorHAnsi" w:eastAsiaTheme="minorEastAsia" w:hAnsiTheme="minorHAnsi" w:cstheme="minorBidi"/>
-                <w:smallCaps w:val="0"/>
-                <w:kern w:val="2"/>
-                <w:sz w:val="24"/>
-                <w:szCs w:val="24"/>
-                <w14:ligatures w14:val="standardContextual"/>
-              </w:rPr>
-              <w:tab/>
-            </w:r>
-            <w:r>
-              <w:rPr>
-                <w:rStyle w:val="Lienhypertexte"/>
-              </w:rPr>
-              <w:t>Annexes</w:t>
-            </w:r>
-            <w:r>
-              <w:rPr>
-                <w:webHidden/>
-              </w:rPr>
-              <w:tab/>
-            </w:r>
-            <w:r>
-              <w:rPr>
-                <w:webHidden/>
-              </w:rPr>
-              <w:fldChar w:fldCharType="begin"/>
-            </w:r>
-            <w:r>
-              <w:rPr>
-                <w:webHidden/>
-              </w:rPr>
-              <w:instrText xml:space="preserve"> PAGEREF _Toc224564580 \h </w:instrText>
-            </w:r>
-            <w:r>
-              <w:rPr>
-                <w:webHidden/>
-              </w:rPr>
-            </w:r>
-            <w:r>
-              <w:rPr>
-                <w:webHidden/>
-              </w:rPr>
-              <w:fldChar w:fldCharType="separate"/>
-            </w:r>
-            <w:r>
-              <w:rPr>
-                <w:webHidden/>
-              </w:rPr>
-              <w:t>6</w:t>
-            </w:r>
-            <w:r>
-              <w:rPr>
-                <w:webHidden/>
-              </w:rPr>
-              <w:fldChar w:fldCharType="end"/>
-            </w:r>
-          </w:hyperlink>
-        </w:p>
-        <w:p>
-          <w:pPr>
-            <w:pStyle w:val="TM2"/>
-            <w:rPr>
-              <w:rFonts w:asciiTheme="minorHAnsi" w:eastAsiaTheme="minorEastAsia" w:hAnsiTheme="minorHAnsi" w:cstheme="minorBidi"/>
-              <w:kern w:val="2"/>
-              <w:sz w:val="24"/>
-              <w:szCs w:val="24"/>
-              <w14:ligatures w14:val="standardContextual"/>
-            </w:rPr>
-          </w:pPr>
-          <w:hyperlink w:anchor="_Toc224564581" w:history="1">
-            <w:r>
-              <w:rPr>
-                <w:rStyle w:val="Lienhypertexte"/>
-              </w:rPr>
-              <w:t>8.1</w:t>
-            </w:r>
-            <w:r>
-              <w:rPr>
-                <w:rFonts w:asciiTheme="minorHAnsi" w:eastAsiaTheme="minorEastAsia" w:hAnsiTheme="minorHAnsi" w:cstheme="minorBidi"/>
-                <w:kern w:val="2"/>
-                <w:sz w:val="24"/>
-                <w:szCs w:val="24"/>
-                <w14:ligatures w14:val="standardContextual"/>
-              </w:rPr>
-              <w:tab/>
-            </w:r>
-            <w:r>
-              <w:rPr>
-                <w:rStyle w:val="Lienhypertexte"/>
-              </w:rPr>
-              <w:t>Installation du package openyxl</w:t>
-            </w:r>
-            <w:r>
-              <w:rPr>
-                <w:webHidden/>
-              </w:rPr>
-              <w:tab/>
-            </w:r>
-            <w:r>
-              <w:rPr>
-                <w:webHidden/>
-              </w:rPr>
-              <w:fldChar w:fldCharType="begin"/>
-            </w:r>
-            <w:r>
-              <w:rPr>
-                <w:webHidden/>
-              </w:rPr>
-              <w:instrText xml:space="preserve"> PAGEREF _Toc224564581 \h </w:instrText>
-            </w:r>
-            <w:r>
-              <w:rPr>
-                <w:webHidden/>
-              </w:rPr>
-            </w:r>
-            <w:r>
-              <w:rPr>
-                <w:webHidden/>
-              </w:rPr>
-              <w:fldChar w:fldCharType="separate"/>
-            </w:r>
-            <w:r>
-              <w:rPr>
-                <w:webHidden/>
-              </w:rPr>
-              <w:t>6</w:t>
             </w:r>
             <w:r>
               <w:rPr>
@@ -2670,24 +2629,6 @@
     </w:sdt>
     <w:p>
       <w:pPr>
-        <w:spacing w:before="0" w:after="200" w:line="276" w:lineRule="auto"/>
-        <w:jc w:val="left"/>
-        <w:rPr>
-          <w:rFonts w:eastAsia="Times New Roman" w:cs="Arial"/>
-          <w:b/>
-          <w:bCs/>
-          <w:color w:val="70777A"/>
-          <w:kern w:val="32"/>
-          <w:sz w:val="28"/>
-          <w:szCs w:val="28"/>
-        </w:rPr>
-      </w:pPr>
-      <w:r>
-        <w:br w:type="page"/>
-      </w:r>
-    </w:p>
-    <w:p>
-      <w:pPr>
         <w:pStyle w:val="Titre1"/>
         <w:numPr>
           <w:ilvl w:val="0"/>
@@ -2700,7 +2641,7 @@
       <w:pPr>
         <w:pStyle w:val="Titre1"/>
       </w:pPr>
-      <w:bookmarkStart w:id="1" w:name="_Toc224564570"/>
+      <w:bookmarkStart w:id="1" w:name="_Toc227227673"/>
       <w:r>
         <w:t>Prérequis</w:t>
       </w:r>
@@ -2786,258 +2727,47 @@
       </w:r>
     </w:p>
     <w:p/>
+    <w:p/>
     <w:p>
-      <w:bookmarkStart w:id="2" w:name="_Hlk183424290"/>
-      <w:r>
-        <w:t>Si le package « </w:t>
-      </w:r>
-      <w:proofErr w:type="spellStart"/>
-      <w:r>
-        <w:t>openpyxl</w:t>
-      </w:r>
-      <w:proofErr w:type="spellEnd"/>
-      <w:r>
-        <w:t> » n’est pas installé sur le poste le message d’erreur ci-dessous apparait lors d’une transaction.</w:t>
+      <w:pPr>
+        <w:pStyle w:val="Titre1"/>
+      </w:pPr>
+      <w:bookmarkStart w:id="2" w:name="_Toc227227674"/>
+      <w:r>
+        <w:t>Résumé</w:t>
       </w:r>
       <w:bookmarkEnd w:id="2"/>
     </w:p>
     <w:p/>
     <w:p>
       <w:r>
-        <w:rPr>
-          <w:noProof/>
-        </w:rPr>
-        <mc:AlternateContent>
-          <mc:Choice Requires="wps">
-            <w:drawing>
-              <wp:anchor distT="0" distB="0" distL="114300" distR="114300" simplePos="0" relativeHeight="251660288" behindDoc="0" locked="0" layoutInCell="1" allowOverlap="1" wp14:anchorId="2C853B2D" wp14:editId="514D7223">
-                <wp:simplePos x="0" y="0"/>
-                <wp:positionH relativeFrom="column">
-                  <wp:posOffset>1470660</wp:posOffset>
-                </wp:positionH>
-                <wp:positionV relativeFrom="paragraph">
-                  <wp:posOffset>289560</wp:posOffset>
-                </wp:positionV>
-                <wp:extent cx="1047750" cy="104775"/>
-                <wp:effectExtent l="0" t="0" r="19050" b="28575"/>
-                <wp:wrapNone/>
-                <wp:docPr id="16" name="Rectangle 16"/>
-                <wp:cNvGraphicFramePr/>
-                <a:graphic xmlns:a="http://schemas.openxmlformats.org/drawingml/2006/main">
-                  <a:graphicData uri="http://schemas.microsoft.com/office/word/2010/wordprocessingShape">
-                    <wps:wsp>
-                      <wps:cNvSpPr/>
-                      <wps:spPr>
-                        <a:xfrm>
-                          <a:off x="0" y="0"/>
-                          <a:ext cx="1047750" cy="104775"/>
-                        </a:xfrm>
-                        <a:prstGeom prst="rect">
-                          <a:avLst/>
-                        </a:prstGeom>
-                      </wps:spPr>
-                      <wps:style>
-                        <a:lnRef idx="2">
-                          <a:schemeClr val="accent1">
-                            <a:shade val="50000"/>
-                          </a:schemeClr>
-                        </a:lnRef>
-                        <a:fillRef idx="1">
-                          <a:schemeClr val="accent1"/>
-                        </a:fillRef>
-                        <a:effectRef idx="0">
-                          <a:schemeClr val="accent1"/>
-                        </a:effectRef>
-                        <a:fontRef idx="minor">
-                          <a:schemeClr val="lt1"/>
-                        </a:fontRef>
-                      </wps:style>
-                      <wps:bodyPr rot="0" spcFirstLastPara="0" vertOverflow="overflow" horzOverflow="overflow" vert="horz" wrap="square" lIns="91440" tIns="45720" rIns="91440" bIns="45720" numCol="1" spcCol="0" rtlCol="0" fromWordArt="0" anchor="ctr" anchorCtr="0" forceAA="0" compatLnSpc="1">
-                        <a:prstTxWarp prst="textNoShape">
-                          <a:avLst/>
-                        </a:prstTxWarp>
-                        <a:noAutofit/>
-                      </wps:bodyPr>
-                    </wps:wsp>
-                  </a:graphicData>
-                </a:graphic>
-              </wp:anchor>
-            </w:drawing>
-          </mc:Choice>
-          <mc:Fallback>
-            <w:pict>
-              <v:rect w14:anchorId="2085161C" id="Rectangle 16" o:spid="_x0000_s1026" style="position:absolute;margin-left:115.8pt;margin-top:22.8pt;width:82.5pt;height:8.25pt;z-index:251660288;visibility:visible;mso-wrap-style:square;mso-wrap-distance-left:9pt;mso-wrap-distance-top:0;mso-wrap-distance-right:9pt;mso-wrap-distance-bottom:0;mso-position-horizontal:absolute;mso-position-horizontal-relative:text;mso-position-vertical:absolute;mso-position-vertical-relative:text;v-text-anchor:middle" o:gfxdata="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" fillcolor="#4f81bd [3204]" strokecolor="#243f60 [1604]" strokeweight="2pt"/>
-            </w:pict>
-          </mc:Fallback>
-        </mc:AlternateContent>
-      </w:r>
-      <w:r>
-        <w:rPr>
-          <w:noProof/>
-        </w:rPr>
-        <mc:AlternateContent>
-          <mc:Choice Requires="wps">
-            <w:drawing>
-              <wp:anchor distT="0" distB="0" distL="114300" distR="114300" simplePos="0" relativeHeight="251659264" behindDoc="0" locked="0" layoutInCell="1" allowOverlap="1" wp14:anchorId="4A12F80A" wp14:editId="2BBB1B67">
-                <wp:simplePos x="0" y="0"/>
-                <wp:positionH relativeFrom="column">
-                  <wp:posOffset>41910</wp:posOffset>
-                </wp:positionH>
-                <wp:positionV relativeFrom="paragraph">
-                  <wp:posOffset>461010</wp:posOffset>
-                </wp:positionV>
-                <wp:extent cx="2743200" cy="314325"/>
-                <wp:effectExtent l="0" t="0" r="19050" b="28575"/>
-                <wp:wrapNone/>
-                <wp:docPr id="7" name="Ellipse 7"/>
-                <wp:cNvGraphicFramePr/>
-                <a:graphic xmlns:a="http://schemas.openxmlformats.org/drawingml/2006/main">
-                  <a:graphicData uri="http://schemas.microsoft.com/office/word/2010/wordprocessingShape">
-                    <wps:wsp>
-                      <wps:cNvSpPr/>
-                      <wps:spPr>
-                        <a:xfrm>
-                          <a:off x="0" y="0"/>
-                          <a:ext cx="2743200" cy="314325"/>
-                        </a:xfrm>
-                        <a:prstGeom prst="ellipse">
-                          <a:avLst/>
-                        </a:prstGeom>
-                        <a:noFill/>
-                        <a:ln>
-                          <a:solidFill>
-                            <a:srgbClr val="FF0000"/>
-                          </a:solidFill>
-                        </a:ln>
-                      </wps:spPr>
-                      <wps:style>
-                        <a:lnRef idx="2">
-                          <a:schemeClr val="accent1">
-                            <a:shade val="50000"/>
-                          </a:schemeClr>
-                        </a:lnRef>
-                        <a:fillRef idx="1">
-                          <a:schemeClr val="accent1"/>
-                        </a:fillRef>
-                        <a:effectRef idx="0">
-                          <a:schemeClr val="accent1"/>
-                        </a:effectRef>
-                        <a:fontRef idx="minor">
-                          <a:schemeClr val="lt1"/>
-                        </a:fontRef>
-                      </wps:style>
-                      <wps:bodyPr rot="0" spcFirstLastPara="0" vertOverflow="overflow" horzOverflow="overflow" vert="horz" wrap="square" lIns="91440" tIns="45720" rIns="91440" bIns="45720" numCol="1" spcCol="0" rtlCol="0" fromWordArt="0" anchor="ctr" anchorCtr="0" forceAA="0" compatLnSpc="1">
-                        <a:prstTxWarp prst="textNoShape">
-                          <a:avLst/>
-                        </a:prstTxWarp>
-                        <a:noAutofit/>
-                      </wps:bodyPr>
-                    </wps:wsp>
-                  </a:graphicData>
-                </a:graphic>
-              </wp:anchor>
-            </w:drawing>
-          </mc:Choice>
-          <mc:Fallback>
-            <w:pict>
-              <v:oval w14:anchorId="5CCC03D7" id="Ellipse 7" o:spid="_x0000_s1026" style="position:absolute;margin-left:3.3pt;margin-top:36.3pt;width:3in;height:24.75pt;z-index:251659264;visibility:visible;mso-wrap-style:square;mso-wrap-distance-left:9pt;mso-wrap-distance-top:0;mso-wrap-distance-right:9pt;mso-wrap-distance-bottom:0;mso-position-horizontal:absolute;mso-position-horizontal-relative:text;mso-position-vertical:absolute;mso-position-vertical-relative:text;v-text-anchor:middle" o:gfxdata="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" filled="f" strokecolor="red" strokeweight="2pt"/>
-            </w:pict>
-          </mc:Fallback>
-        </mc:AlternateContent>
-      </w:r>
-      <w:r>
-        <w:rPr>
-          <w:noProof/>
-        </w:rPr>
-        <w:drawing>
-          <wp:inline distT="0" distB="0" distL="0" distR="0" wp14:anchorId="47986D25" wp14:editId="0E92D7EC">
-            <wp:extent cx="6253480" cy="1913890"/>
-            <wp:effectExtent l="0" t="0" r="0" b="0"/>
-            <wp:docPr id="6" name="Image 6"/>
-            <wp:cNvGraphicFramePr>
-              <a:graphicFrameLocks xmlns:a="http://schemas.openxmlformats.org/drawingml/2006/main" noChangeAspect="1"/>
-            </wp:cNvGraphicFramePr>
-            <a:graphic xmlns:a="http://schemas.openxmlformats.org/drawingml/2006/main">
-              <a:graphicData uri="http://schemas.openxmlformats.org/drawingml/2006/picture">
-                <pic:pic xmlns:pic="http://schemas.openxmlformats.org/drawingml/2006/picture">
-                  <pic:nvPicPr>
-                    <pic:cNvPr id="6" name="Image 6"/>
-                    <pic:cNvPicPr/>
-                  </pic:nvPicPr>
-                  <pic:blipFill>
-                    <a:blip r:embed="rId12">
-                      <a:extLst>
-                        <a:ext uri="{28A0092B-C50C-407E-A947-70E740481C1C}">
-                          <a14:useLocalDpi xmlns:a14="http://schemas.microsoft.com/office/drawing/2010/main" val="0"/>
-                        </a:ext>
-                      </a:extLst>
-                    </a:blip>
-                    <a:stretch>
-                      <a:fillRect/>
-                    </a:stretch>
-                  </pic:blipFill>
-                  <pic:spPr>
-                    <a:xfrm>
-                      <a:off x="0" y="0"/>
-                      <a:ext cx="6253480" cy="1913890"/>
-                    </a:xfrm>
-                    <a:prstGeom prst="rect">
-                      <a:avLst/>
-                    </a:prstGeom>
-                  </pic:spPr>
-                </pic:pic>
-              </a:graphicData>
-            </a:graphic>
-          </wp:inline>
-        </w:drawing>
+        <w:t xml:space="preserve">Ce plugin est une aide à la </w:t>
+      </w:r>
+      <w:r>
+        <w:t xml:space="preserve">modification des attributs des tronçons de routes </w:t>
+      </w:r>
+      <w:r>
+        <w:t xml:space="preserve">de la BDTopo </w:t>
+      </w:r>
+      <w:r>
+        <w:t>en y intégrant des contrôles sémantiques pour tout changements.</w:t>
       </w:r>
     </w:p>
     <w:p/>
+    <w:p/>
     <w:p>
-      <w:r>
-        <w:t>Voir la résolution de ce problème à la fin de cette documentation dans la partie Annexes.</w:t>
-      </w:r>
-    </w:p>
-    <w:p>
       <w:pPr>
         <w:pStyle w:val="Titre1"/>
       </w:pPr>
-      <w:bookmarkStart w:id="3" w:name="_Toc224564571"/>
-      <w:r>
-        <w:t>Résumé</w:t>
+      <w:bookmarkStart w:id="3" w:name="_Toc227227675"/>
+      <w:r>
+        <w:t>Installation</w:t>
       </w:r>
       <w:bookmarkEnd w:id="3"/>
     </w:p>
     <w:p/>
     <w:p>
       <w:r>
-        <w:t xml:space="preserve">Ce plugin est une aide à la </w:t>
-      </w:r>
-      <w:r>
-        <w:t xml:space="preserve">modification des attributs des tronçons de routes </w:t>
-      </w:r>
-      <w:r>
-        <w:t xml:space="preserve">de la BDTopo </w:t>
-      </w:r>
-      <w:r>
-        <w:t>en y intégrant des contrôles sémantiques pour tout changements.</w:t>
-      </w:r>
-    </w:p>
-    <w:p/>
-    <w:p/>
-    <w:p>
-      <w:pPr>
-        <w:pStyle w:val="Titre1"/>
-      </w:pPr>
-      <w:bookmarkStart w:id="4" w:name="_Toc224564572"/>
-      <w:r>
-        <w:t>Installation</w:t>
-      </w:r>
-      <w:bookmarkEnd w:id="4"/>
-    </w:p>
-    <w:p/>
-    <w:p>
-      <w:r>
         <w:t>Le plugin s’installe en lançant l’exécutable d’installation et en cochant le plugin route.</w:t>
       </w:r>
     </w:p>
@@ -3059,12 +2789,12 @@
       <w:pPr>
         <w:pStyle w:val="Titre1"/>
       </w:pPr>
-      <w:bookmarkStart w:id="5" w:name="_Toc224564573"/>
+      <w:bookmarkStart w:id="4" w:name="_Toc227227676"/>
       <w:r>
         <w:lastRenderedPageBreak/>
         <w:t>Présentation</w:t>
       </w:r>
-      <w:bookmarkEnd w:id="5"/>
+      <w:bookmarkEnd w:id="4"/>
     </w:p>
     <w:p/>
     <w:p/>
@@ -3092,7 +2822,7 @@
                     <pic:cNvPicPr/>
                   </pic:nvPicPr>
                   <pic:blipFill>
-                    <a:blip r:embed="rId13"/>
+                    <a:blip r:embed="rId12"/>
                     <a:stretch>
                       <a:fillRect/>
                     </a:stretch>
@@ -3201,7 +2931,7 @@
                     <pic:cNvPicPr/>
                   </pic:nvPicPr>
                   <pic:blipFill>
-                    <a:blip r:embed="rId14">
+                    <a:blip r:embed="rId13">
                       <a:extLst>
                         <a:ext uri="{28A0092B-C50C-407E-A947-70E740481C1C}">
                           <a14:useLocalDpi xmlns:a14="http://schemas.microsoft.com/office/drawing/2010/main" val="0"/>
@@ -3256,7 +2986,7 @@
                     <pic:cNvPicPr/>
                   </pic:nvPicPr>
                   <pic:blipFill>
-                    <a:blip r:embed="rId15"/>
+                    <a:blip r:embed="rId14"/>
                     <a:stretch>
                       <a:fillRect/>
                     </a:stretch>
@@ -3305,7 +3035,7 @@
                     <pic:cNvPicPr/>
                   </pic:nvPicPr>
                   <pic:blipFill>
-                    <a:blip r:embed="rId16"/>
+                    <a:blip r:embed="rId15"/>
                     <a:stretch>
                       <a:fillRect/>
                     </a:stretch>
@@ -3354,7 +3084,7 @@
                     <pic:cNvPicPr/>
                   </pic:nvPicPr>
                   <pic:blipFill>
-                    <a:blip r:embed="rId17"/>
+                    <a:blip r:embed="rId16"/>
                     <a:stretch>
                       <a:fillRect/>
                     </a:stretch>
@@ -3524,7 +3254,7 @@
                     <pic:cNvPicPr/>
                   </pic:nvPicPr>
                   <pic:blipFill>
-                    <a:blip r:embed="rId18"/>
+                    <a:blip r:embed="rId17"/>
                     <a:stretch>
                       <a:fillRect/>
                     </a:stretch>
@@ -3699,7 +3429,7 @@
                     <pic:cNvPicPr/>
                   </pic:nvPicPr>
                   <pic:blipFill>
-                    <a:blip r:embed="rId19"/>
+                    <a:blip r:embed="rId18"/>
                     <a:stretch>
                       <a:fillRect/>
                     </a:stretch>
@@ -3727,23 +3457,23 @@
       <w:pPr>
         <w:pStyle w:val="Titre1"/>
       </w:pPr>
-      <w:bookmarkStart w:id="6" w:name="_Toc224564574"/>
+      <w:bookmarkStart w:id="5" w:name="_Toc227227677"/>
       <w:r>
         <w:lastRenderedPageBreak/>
         <w:t>Mode de sélection</w:t>
       </w:r>
-      <w:bookmarkEnd w:id="6"/>
+      <w:bookmarkEnd w:id="5"/>
     </w:p>
     <w:p/>
     <w:p>
       <w:pPr>
         <w:pStyle w:val="Titre2"/>
       </w:pPr>
-      <w:bookmarkStart w:id="7" w:name="_Toc224564575"/>
+      <w:bookmarkStart w:id="6" w:name="_Toc227227678"/>
       <w:r>
         <w:t>Sélection unique</w:t>
       </w:r>
-      <w:bookmarkEnd w:id="7"/>
+      <w:bookmarkEnd w:id="6"/>
     </w:p>
     <w:p/>
     <w:p>
@@ -3788,7 +3518,7 @@
                     <pic:cNvPicPr/>
                   </pic:nvPicPr>
                   <pic:blipFill>
-                    <a:blip r:embed="rId20"/>
+                    <a:blip r:embed="rId19"/>
                     <a:stretch>
                       <a:fillRect/>
                     </a:stretch>
@@ -3852,11 +3582,11 @@
       <w:pPr>
         <w:pStyle w:val="Titre2"/>
       </w:pPr>
-      <w:bookmarkStart w:id="8" w:name="_Toc224564576"/>
+      <w:bookmarkStart w:id="7" w:name="_Toc227227679"/>
       <w:r>
         <w:t>Sélection multiple</w:t>
       </w:r>
-      <w:bookmarkEnd w:id="8"/>
+      <w:bookmarkEnd w:id="7"/>
     </w:p>
     <w:p/>
     <w:p>
@@ -3944,7 +3674,7 @@
                     <pic:cNvPicPr/>
                   </pic:nvPicPr>
                   <pic:blipFill>
-                    <a:blip r:embed="rId17"/>
+                    <a:blip r:embed="rId16"/>
                     <a:stretch>
                       <a:fillRect/>
                     </a:stretch>
@@ -4094,7 +3824,7 @@
                     <pic:cNvPicPr/>
                   </pic:nvPicPr>
                   <pic:blipFill>
-                    <a:blip r:embed="rId21"/>
+                    <a:blip r:embed="rId20"/>
                     <a:stretch>
                       <a:fillRect/>
                     </a:stretch>
@@ -4150,24 +3880,24 @@
       <w:pPr>
         <w:pStyle w:val="Titre1"/>
       </w:pPr>
-      <w:bookmarkStart w:id="9" w:name="_Toc223425641"/>
-      <w:bookmarkStart w:id="10" w:name="_Toc223756086"/>
-      <w:bookmarkStart w:id="11" w:name="_Toc223425646"/>
-      <w:bookmarkStart w:id="12" w:name="_Toc223756091"/>
-      <w:bookmarkStart w:id="13" w:name="_Toc223425647"/>
-      <w:bookmarkStart w:id="14" w:name="_Toc223756092"/>
-      <w:bookmarkStart w:id="15" w:name="_Toc215049623"/>
-      <w:bookmarkStart w:id="16" w:name="_Toc224564577"/>
+      <w:bookmarkStart w:id="8" w:name="_Toc223425641"/>
+      <w:bookmarkStart w:id="9" w:name="_Toc223756086"/>
+      <w:bookmarkStart w:id="10" w:name="_Toc223425646"/>
+      <w:bookmarkStart w:id="11" w:name="_Toc223756091"/>
+      <w:bookmarkStart w:id="12" w:name="_Toc223425647"/>
+      <w:bookmarkStart w:id="13" w:name="_Toc223756092"/>
+      <w:bookmarkStart w:id="14" w:name="_Toc215049623"/>
+      <w:bookmarkStart w:id="15" w:name="_Toc227227680"/>
+      <w:bookmarkEnd w:id="8"/>
       <w:bookmarkEnd w:id="9"/>
       <w:bookmarkEnd w:id="10"/>
       <w:bookmarkEnd w:id="11"/>
       <w:bookmarkEnd w:id="12"/>
       <w:bookmarkEnd w:id="13"/>
-      <w:bookmarkEnd w:id="14"/>
       <w:r>
         <w:t>Modification</w:t>
       </w:r>
-      <w:bookmarkEnd w:id="16"/>
+      <w:bookmarkEnd w:id="15"/>
     </w:p>
     <w:p>
       <w:pPr>
@@ -4210,7 +3940,7 @@
                     <pic:cNvPicPr/>
                   </pic:nvPicPr>
                   <pic:blipFill>
-                    <a:blip r:embed="rId22"/>
+                    <a:blip r:embed="rId21"/>
                     <a:stretch>
                       <a:fillRect/>
                     </a:stretch>
@@ -4332,7 +4062,7 @@
                                           <pic:cNvPicPr/>
                                         </pic:nvPicPr>
                                         <pic:blipFill>
-                                          <a:blip r:embed="rId23"/>
+                                          <a:blip r:embed="rId22"/>
                                           <a:stretch>
                                             <a:fillRect/>
                                           </a:stretch>
@@ -4429,7 +4159,7 @@
                                     <pic:cNvPicPr/>
                                   </pic:nvPicPr>
                                   <pic:blipFill>
-                                    <a:blip r:embed="rId23"/>
+                                    <a:blip r:embed="rId22"/>
                                     <a:stretch>
                                       <a:fillRect/>
                                     </a:stretch>
@@ -4522,7 +4252,7 @@
                     <pic:cNvPicPr/>
                   </pic:nvPicPr>
                   <pic:blipFill>
-                    <a:blip r:embed="rId24"/>
+                    <a:blip r:embed="rId23"/>
                     <a:stretch>
                       <a:fillRect/>
                     </a:stretch>
@@ -4569,7 +4299,7 @@
                     <pic:cNvPicPr/>
                   </pic:nvPicPr>
                   <pic:blipFill>
-                    <a:blip r:embed="rId25"/>
+                    <a:blip r:embed="rId24"/>
                     <a:stretch>
                       <a:fillRect/>
                     </a:stretch>
@@ -4623,13 +4353,13 @@
       <w:pPr>
         <w:pStyle w:val="Titre1"/>
       </w:pPr>
-      <w:bookmarkStart w:id="17" w:name="_Toc224564578"/>
+      <w:bookmarkStart w:id="16" w:name="_Toc227227681"/>
       <w:r>
         <w:t>Extra</w:t>
       </w:r>
-      <w:bookmarkEnd w:id="17"/>
+      <w:bookmarkEnd w:id="16"/>
     </w:p>
-    <w:bookmarkEnd w:id="15"/>
+    <w:bookmarkEnd w:id="14"/>
     <w:p>
       <w:pPr>
         <w:spacing w:line="276" w:lineRule="auto"/>
@@ -4640,13 +4370,13 @@
         <w:pStyle w:val="Titre2"/>
         <w:ind w:firstLine="576"/>
       </w:pPr>
-      <w:bookmarkStart w:id="18" w:name="_Toc182399295"/>
-      <w:bookmarkStart w:id="19" w:name="_Toc224564579"/>
+      <w:bookmarkStart w:id="17" w:name="_Toc182399295"/>
+      <w:bookmarkStart w:id="18" w:name="_Toc227227682"/>
       <w:r>
         <w:t>A propos</w:t>
       </w:r>
+      <w:bookmarkEnd w:id="17"/>
       <w:bookmarkEnd w:id="18"/>
-      <w:bookmarkEnd w:id="19"/>
     </w:p>
     <w:p>
       <w:pPr>
@@ -4680,7 +4410,7 @@
                     <pic:cNvPicPr/>
                   </pic:nvPicPr>
                   <pic:blipFill>
-                    <a:blip r:embed="rId26">
+                    <a:blip r:embed="rId25">
                       <a:extLst>
                         <a:ext uri="{28A0092B-C50C-407E-A947-70E740481C1C}">
                           <a14:useLocalDpi xmlns:a14="http://schemas.microsoft.com/office/drawing/2010/main" val="0"/>
@@ -4739,14 +4469,11 @@
         <w:ind w:left="708" w:firstLine="708"/>
       </w:pPr>
       <w:r>
-        <w:rPr>
-          <w:noProof/>
-        </w:rPr>
         <w:drawing>
-          <wp:inline distT="0" distB="0" distL="0" distR="0" wp14:anchorId="7658C77C" wp14:editId="367767FA">
-            <wp:extent cx="1709738" cy="2494823"/>
-            <wp:effectExtent l="0" t="0" r="5080" b="1270"/>
-            <wp:docPr id="27" name="Image 27"/>
+          <wp:inline distT="0" distB="0" distL="0" distR="0" wp14:anchorId="013C0F79" wp14:editId="7DDAD887">
+            <wp:extent cx="2152650" cy="3141112"/>
+            <wp:effectExtent l="0" t="0" r="0" b="2540"/>
+            <wp:docPr id="2080714143" name="Image 1"/>
             <wp:cNvGraphicFramePr>
               <a:graphicFrameLocks xmlns:a="http://schemas.openxmlformats.org/drawingml/2006/main" noChangeAspect="1"/>
             </wp:cNvGraphicFramePr>
@@ -4754,11 +4481,11 @@
               <a:graphicData uri="http://schemas.openxmlformats.org/drawingml/2006/picture">
                 <pic:pic xmlns:pic="http://schemas.openxmlformats.org/drawingml/2006/picture">
                   <pic:nvPicPr>
-                    <pic:cNvPr id="1" name=""/>
+                    <pic:cNvPr id="2080714143" name=""/>
                     <pic:cNvPicPr/>
                   </pic:nvPicPr>
                   <pic:blipFill>
-                    <a:blip r:embed="rId27"/>
+                    <a:blip r:embed="rId26"/>
                     <a:stretch>
                       <a:fillRect/>
                     </a:stretch>
@@ -4766,7 +4493,7 @@
                   <pic:spPr>
                     <a:xfrm>
                       <a:off x="0" y="0"/>
-                      <a:ext cx="1718290" cy="2507302"/>
+                      <a:ext cx="2155817" cy="3145734"/>
                     </a:xfrm>
                     <a:prstGeom prst="rect">
                       <a:avLst/>
@@ -4779,226 +4506,12 @@
         </w:drawing>
       </w:r>
     </w:p>
-    <w:p>
-      <w:pPr>
-        <w:ind w:firstLine="576"/>
-      </w:pPr>
-    </w:p>
-    <w:p>
-      <w:pPr>
-        <w:ind w:firstLine="576"/>
-      </w:pPr>
-    </w:p>
-    <w:p>
-      <w:pPr>
-        <w:ind w:firstLine="576"/>
-      </w:pPr>
-    </w:p>
     <w:p/>
     <w:p/>
     <w:p/>
-    <w:p/>
-    <w:p/>
-    <w:p/>
-    <w:p/>
-    <w:p/>
-    <w:p/>
-    <w:p/>
-    <w:p/>
-    <w:p/>
-    <w:p/>
-    <w:p>
-      <w:pPr>
-        <w:pStyle w:val="Titre1"/>
-      </w:pPr>
-      <w:bookmarkStart w:id="20" w:name="_Toc224564580"/>
-      <w:r>
-        <w:t>Annexes</w:t>
-      </w:r>
-      <w:bookmarkEnd w:id="20"/>
-    </w:p>
-    <w:p/>
-    <w:p>
-      <w:pPr>
-        <w:pStyle w:val="Titre2"/>
-      </w:pPr>
-      <w:bookmarkStart w:id="21" w:name="_Toc224564581"/>
-      <w:r>
-        <w:t xml:space="preserve">Installation du package </w:t>
-      </w:r>
-      <w:proofErr w:type="spellStart"/>
-      <w:r>
-        <w:t>openyxl</w:t>
-      </w:r>
-      <w:bookmarkEnd w:id="21"/>
-      <w:proofErr w:type="spellEnd"/>
-    </w:p>
-    <w:p/>
-    <w:p>
-      <w:bookmarkStart w:id="22" w:name="_Hlk183424311"/>
-      <w:r>
-        <w:t>Ouvrir l’invite de commande, se placer dans le répertoire « bin » de l’installation de QGIS :</w:t>
-      </w:r>
-    </w:p>
-    <w:p>
-      <w:r>
-        <w:t xml:space="preserve">Exemple : </w:t>
-      </w:r>
-    </w:p>
-    <w:bookmarkEnd w:id="22"/>
-    <w:p>
-      <w:pPr>
-        <w:jc w:val="center"/>
-      </w:pPr>
-    </w:p>
-    <w:p>
-      <w:r>
-        <w:rPr>
-          <w:noProof/>
-        </w:rPr>
-        <w:drawing>
-          <wp:inline distT="0" distB="0" distL="0" distR="0" wp14:anchorId="464A2EEC" wp14:editId="26F6E2EF">
-            <wp:extent cx="5268060" cy="1581371"/>
-            <wp:effectExtent l="0" t="0" r="0" b="0"/>
-            <wp:docPr id="9" name="Image 9"/>
-            <wp:cNvGraphicFramePr>
-              <a:graphicFrameLocks xmlns:a="http://schemas.openxmlformats.org/drawingml/2006/main" noChangeAspect="1"/>
-            </wp:cNvGraphicFramePr>
-            <a:graphic xmlns:a="http://schemas.openxmlformats.org/drawingml/2006/main">
-              <a:graphicData uri="http://schemas.openxmlformats.org/drawingml/2006/picture">
-                <pic:pic xmlns:pic="http://schemas.openxmlformats.org/drawingml/2006/picture">
-                  <pic:nvPicPr>
-                    <pic:cNvPr id="9" name="Image 9"/>
-                    <pic:cNvPicPr/>
-                  </pic:nvPicPr>
-                  <pic:blipFill>
-                    <a:blip r:embed="rId28">
-                      <a:extLst>
-                        <a:ext uri="{28A0092B-C50C-407E-A947-70E740481C1C}">
-                          <a14:useLocalDpi xmlns:a14="http://schemas.microsoft.com/office/drawing/2010/main" val="0"/>
-                        </a:ext>
-                      </a:extLst>
-                    </a:blip>
-                    <a:stretch>
-                      <a:fillRect/>
-                    </a:stretch>
-                  </pic:blipFill>
-                  <pic:spPr>
-                    <a:xfrm>
-                      <a:off x="0" y="0"/>
-                      <a:ext cx="5268060" cy="1581371"/>
-                    </a:xfrm>
-                    <a:prstGeom prst="rect">
-                      <a:avLst/>
-                    </a:prstGeom>
-                  </pic:spPr>
-                </pic:pic>
-              </a:graphicData>
-            </a:graphic>
-          </wp:inline>
-        </w:drawing>
-      </w:r>
-    </w:p>
-    <w:p/>
-    <w:p>
-      <w:bookmarkStart w:id="23" w:name="_Hlk183424337"/>
-      <w:r>
-        <w:t xml:space="preserve">Puis taper la commande : </w:t>
-      </w:r>
-      <w:r>
-        <w:t>python-qgis-ltr.bat</w:t>
-      </w:r>
-      <w:r>
-        <w:t xml:space="preserve"> -m </w:t>
-      </w:r>
-      <w:proofErr w:type="spellStart"/>
-      <w:r>
-        <w:t>pip</w:t>
-      </w:r>
-      <w:proofErr w:type="spellEnd"/>
-      <w:r>
-        <w:t xml:space="preserve"> </w:t>
-      </w:r>
-      <w:proofErr w:type="spellStart"/>
-      <w:r>
-        <w:t>install</w:t>
-      </w:r>
-      <w:proofErr w:type="spellEnd"/>
-      <w:r>
-        <w:t xml:space="preserve"> </w:t>
-      </w:r>
-      <w:proofErr w:type="spellStart"/>
-      <w:r>
-        <w:t>openpyxl</w:t>
-      </w:r>
-      <w:proofErr w:type="spellEnd"/>
-    </w:p>
-    <w:bookmarkEnd w:id="23"/>
-    <w:p/>
-    <w:p>
-      <w:pPr>
-        <w:jc w:val="center"/>
-      </w:pPr>
-      <w:r>
-        <w:rPr>
-          <w:noProof/>
-        </w:rPr>
-        <w:drawing>
-          <wp:inline distT="0" distB="0" distL="0" distR="0" wp14:anchorId="686CC470" wp14:editId="2FB8DFD2">
-            <wp:extent cx="6253480" cy="1409065"/>
-            <wp:effectExtent l="0" t="0" r="0" b="635"/>
-            <wp:docPr id="15" name="Image 15"/>
-            <wp:cNvGraphicFramePr>
-              <a:graphicFrameLocks xmlns:a="http://schemas.openxmlformats.org/drawingml/2006/main" noChangeAspect="1"/>
-            </wp:cNvGraphicFramePr>
-            <a:graphic xmlns:a="http://schemas.openxmlformats.org/drawingml/2006/main">
-              <a:graphicData uri="http://schemas.openxmlformats.org/drawingml/2006/picture">
-                <pic:pic xmlns:pic="http://schemas.openxmlformats.org/drawingml/2006/picture">
-                  <pic:nvPicPr>
-                    <pic:cNvPr id="15" name="Image 15"/>
-                    <pic:cNvPicPr/>
-                  </pic:nvPicPr>
-                  <pic:blipFill>
-                    <a:blip r:embed="rId29">
-                      <a:extLst>
-                        <a:ext uri="{28A0092B-C50C-407E-A947-70E740481C1C}">
-                          <a14:useLocalDpi xmlns:a14="http://schemas.microsoft.com/office/drawing/2010/main" val="0"/>
-                        </a:ext>
-                      </a:extLst>
-                    </a:blip>
-                    <a:stretch>
-                      <a:fillRect/>
-                    </a:stretch>
-                  </pic:blipFill>
-                  <pic:spPr>
-                    <a:xfrm>
-                      <a:off x="0" y="0"/>
-                      <a:ext cx="6253480" cy="1409065"/>
-                    </a:xfrm>
-                    <a:prstGeom prst="rect">
-                      <a:avLst/>
-                    </a:prstGeom>
-                  </pic:spPr>
-                </pic:pic>
-              </a:graphicData>
-            </a:graphic>
-          </wp:inline>
-        </w:drawing>
-      </w:r>
-    </w:p>
-    <w:p/>
-    <w:p>
-      <w:bookmarkStart w:id="24" w:name="_Hlk183424357"/>
-      <w:r>
-        <w:t>Le package s’installe, vous n’avez plus qu’à relancer QGIS.</w:t>
-      </w:r>
-    </w:p>
-    <w:bookmarkEnd w:id="24"/>
-    <w:p/>
-    <w:p/>
     <w:sectPr>
-      <w:footerReference w:type="default" r:id="rId30"/>
-      <w:footerReference w:type="first" r:id="rId31"/>
+      <w:footerReference w:type="default" r:id="rId27"/>
+      <w:footerReference w:type="first" r:id="rId28"/>
       <w:pgSz w:w="11906" w:h="16838" w:code="9"/>
       <w:pgMar w:top="851" w:right="924" w:bottom="1616" w:left="1134" w:header="709" w:footer="607" w:gutter="0"/>
       <w:cols w:space="708"/>
@@ -8079,11 +7592,13 @@
     <w:rsidRoot w:val="00CA38A7"/>
     <w:rsid w:val="00065F3B"/>
     <w:rsid w:val="000D4DEE"/>
+    <w:rsid w:val="000E4454"/>
     <w:rsid w:val="00103B80"/>
     <w:rsid w:val="00162DC9"/>
     <w:rsid w:val="00297774"/>
     <w:rsid w:val="003259A4"/>
     <w:rsid w:val="00471113"/>
+    <w:rsid w:val="00501022"/>
     <w:rsid w:val="0054019A"/>
     <w:rsid w:val="00596E3A"/>
     <w:rsid w:val="00620954"/>
@@ -8894,10 +8409,6 @@
 </file>
 
 <file path=customXml/item1.xml><?xml version="1.0" encoding="utf-8"?>
-<b:Sources xmlns:b="http://schemas.openxmlformats.org/officeDocument/2006/bibliography" xmlns="http://schemas.openxmlformats.org/officeDocument/2006/bibliography" SelectedStyle="\APA.XSL" StyleName="APA"/>
-</file>
-
-<file path=customXml/item2.xml><?xml version="1.0" encoding="utf-8"?>
 <ct:contentTypeSchema xmlns:ct="http://schemas.microsoft.com/office/2006/metadata/contentType" xmlns:ma="http://schemas.microsoft.com/office/2006/metadata/properties/metaAttributes" ct:_="" ma:_="" ma:contentTypeName="Document" ma:contentTypeID="0x010100A3FA4CB5114F4B43B99F0B6DC8751D90" ma:contentTypeVersion="10" ma:contentTypeDescription="Crée un document." ma:contentTypeScope="" ma:versionID="501205be520febb413c56432ff8e6df1">
   <xsd:schema xmlns:xsd="http://www.w3.org/2001/XMLSchema" xmlns:xs="http://www.w3.org/2001/XMLSchema" xmlns:p="http://schemas.microsoft.com/office/2006/metadata/properties" xmlns:ns2="b295003c-aa87-407e-9024-fdee4e88f6fa" targetNamespace="http://schemas.microsoft.com/office/2006/metadata/properties" ma:root="true" ma:fieldsID="0378f5bf275aa5e8e5bb75b38d3da7db" ns2:_="">
     <xsd:import namespace="b295003c-aa87-407e-9024-fdee4e88f6fa"/>
@@ -9075,16 +8586,11 @@
 </ct:contentTypeSchema>
 </file>
 
-<file path=customXml/item3.xml><?xml version="1.0" encoding="utf-8"?>
-<?mso-contentType ?>
-<FormTemplates xmlns="http://schemas.microsoft.com/sharepoint/v3/contenttype/forms">
-  <Display>DocumentLibraryForm</Display>
-  <Edit>DocumentLibraryForm</Edit>
-  <New>DocumentLibraryForm</New>
-</FormTemplates>
+<file path=customXml/item2.xml><?xml version="1.0" encoding="utf-8"?>
+<b:Sources xmlns:b="http://schemas.openxmlformats.org/officeDocument/2006/bibliography" xmlns="http://schemas.openxmlformats.org/officeDocument/2006/bibliography" SelectedStyle="\APA.XSL" StyleName="APA"/>
 </file>
 
-<file path=customXml/item4.xml><?xml version="1.0" encoding="utf-8"?>
+<file path=customXml/item3.xml><?xml version="1.0" encoding="utf-8"?>
 <p:properties xmlns:p="http://schemas.microsoft.com/office/2006/metadata/properties" xmlns:xsi="http://www.w3.org/2001/XMLSchema-instance" xmlns:pc="http://schemas.microsoft.com/office/infopath/2007/PartnerControls">
   <documentManagement>
     <lcf76f155ced4ddcb4097134ff3c332f xmlns="b295003c-aa87-407e-9024-fdee4e88f6fa">
@@ -9094,15 +8600,16 @@
 </p:properties>
 </file>
 
-<file path=customXml/itemProps1.xml><?xml version="1.0" encoding="utf-8"?>
-<ds:datastoreItem xmlns:ds="http://schemas.openxmlformats.org/officeDocument/2006/customXml" ds:itemID="{0FF0F878-5F0F-460C-9013-40E72731A637}">
-  <ds:schemaRefs>
-    <ds:schemaRef ds:uri="http://schemas.openxmlformats.org/officeDocument/2006/bibliography"/>
-  </ds:schemaRefs>
-</ds:datastoreItem>
+<file path=customXml/item4.xml><?xml version="1.0" encoding="utf-8"?>
+<?mso-contentType ?>
+<FormTemplates xmlns="http://schemas.microsoft.com/sharepoint/v3/contenttype/forms">
+  <Display>DocumentLibraryForm</Display>
+  <Edit>DocumentLibraryForm</Edit>
+  <New>DocumentLibraryForm</New>
+</FormTemplates>
 </file>
 
-<file path=customXml/itemProps2.xml><?xml version="1.0" encoding="utf-8"?>
+<file path=customXml/itemProps1.xml><?xml version="1.0" encoding="utf-8"?>
 <ds:datastoreItem xmlns:ds="http://schemas.openxmlformats.org/officeDocument/2006/customXml" ds:itemID="{0B65258C-9CEC-414A-989C-54F659AC270E}">
   <ds:schemaRefs>
     <ds:schemaRef ds:uri="http://schemas.microsoft.com/office/2006/metadata/contentType"/>
@@ -9120,15 +8627,15 @@
 </ds:datastoreItem>
 </file>
 
-<file path=customXml/itemProps3.xml><?xml version="1.0" encoding="utf-8"?>
-<ds:datastoreItem xmlns:ds="http://schemas.openxmlformats.org/officeDocument/2006/customXml" ds:itemID="{EEE2973D-7DD7-4773-855D-5CAD81242BDE}">
+<file path=customXml/itemProps2.xml><?xml version="1.0" encoding="utf-8"?>
+<ds:datastoreItem xmlns:ds="http://schemas.openxmlformats.org/officeDocument/2006/customXml" ds:itemID="{0FF0F878-5F0F-460C-9013-40E72731A637}">
   <ds:schemaRefs>
-    <ds:schemaRef ds:uri="http://schemas.microsoft.com/sharepoint/v3/contenttype/forms"/>
+    <ds:schemaRef ds:uri="http://schemas.openxmlformats.org/officeDocument/2006/bibliography"/>
   </ds:schemaRefs>
 </ds:datastoreItem>
 </file>
 
-<file path=customXml/itemProps4.xml><?xml version="1.0" encoding="utf-8"?>
+<file path=customXml/itemProps3.xml><?xml version="1.0" encoding="utf-8"?>
 <ds:datastoreItem xmlns:ds="http://schemas.openxmlformats.org/officeDocument/2006/customXml" ds:itemID="{1159403A-C237-488E-8C5E-DABF9FCE7043}">
   <ds:schemaRefs>
     <ds:schemaRef ds:uri="http://schemas.microsoft.com/office/2006/metadata/properties"/>
@@ -9136,4 +8643,12 @@
     <ds:schemaRef ds:uri="b295003c-aa87-407e-9024-fdee4e88f6fa"/>
   </ds:schemaRefs>
 </ds:datastoreItem>
+</file>
+
+<file path=customXml/itemProps4.xml><?xml version="1.0" encoding="utf-8"?>
+<ds:datastoreItem xmlns:ds="http://schemas.openxmlformats.org/officeDocument/2006/customXml" ds:itemID="{EEE2973D-7DD7-4773-855D-5CAD81242BDE}">
+  <ds:schemaRefs>
+    <ds:schemaRef ds:uri="http://schemas.microsoft.com/sharepoint/v3/contenttype/forms"/>
+  </ds:schemaRefs>
+</ds:datastoreItem>
 </file>
</xml_diff>